<commit_message>
Update hackathon PRD and presentation with team information
</commit_message>
<xml_diff>
--- a/docs/Islamabad_GeoIntel_Hackathon_PRD.docx
+++ b/docs/Islamabad_GeoIntel_Hackathon_PRD.docx
@@ -414,6 +414,249 @@
       </w:tr>
     </w:tbl>
     <w:p/>
+    <w:p>
+      <w:pPr>
+        <w:pStyle w:val="Heading1"/>
+      </w:pPr>
+      <w:r>
+        <w:t>Project Team</w:t>
+      </w:r>
+    </w:p>
+    <w:tbl>
+      <w:tblPr>
+        <w:tblStyle w:val="TableGrid"/>
+        <w:tblW w:type="auto" w:w="0"/>
+        <w:tblLook w:firstColumn="1" w:firstRow="1" w:lastColumn="0" w:lastRow="0" w:noHBand="0" w:noVBand="1" w:val="04A0"/>
+      </w:tblPr>
+      <w:tblGrid>
+        <w:gridCol w:w="2541"/>
+        <w:gridCol w:w="2541"/>
+        <w:gridCol w:w="2541"/>
+        <w:gridCol w:w="2541"/>
+      </w:tblGrid>
+      <w:tr>
+        <w:tc>
+          <w:tcPr>
+            <w:tcW w:type="dxa" w:w="2541"/>
+          </w:tcPr>
+          <w:p>
+            <w:r>
+              <w:rPr>
+                <w:b/>
+              </w:rPr>
+              <w:t>Role</w:t>
+            </w:r>
+          </w:p>
+        </w:tc>
+        <w:tc>
+          <w:tcPr>
+            <w:tcW w:type="dxa" w:w="2541"/>
+          </w:tcPr>
+          <w:p>
+            <w:r>
+              <w:rPr>
+                <w:b/>
+              </w:rPr>
+              <w:t>Name</w:t>
+            </w:r>
+          </w:p>
+        </w:tc>
+        <w:tc>
+          <w:tcPr>
+            <w:tcW w:type="dxa" w:w="2541"/>
+          </w:tcPr>
+          <w:p>
+            <w:r>
+              <w:rPr>
+                <w:b/>
+              </w:rPr>
+              <w:t>Email</w:t>
+            </w:r>
+          </w:p>
+        </w:tc>
+        <w:tc>
+          <w:tcPr>
+            <w:tcW w:type="dxa" w:w="2541"/>
+          </w:tcPr>
+          <w:p>
+            <w:r>
+              <w:rPr>
+                <w:b/>
+              </w:rPr>
+              <w:t>Cell phone</w:t>
+            </w:r>
+          </w:p>
+        </w:tc>
+      </w:tr>
+      <w:tr>
+        <w:tc>
+          <w:tcPr>
+            <w:tcW w:type="dxa" w:w="2541"/>
+          </w:tcPr>
+          <w:p>
+            <w:r>
+              <w:t>Team Leader</w:t>
+            </w:r>
+          </w:p>
+        </w:tc>
+        <w:tc>
+          <w:tcPr>
+            <w:tcW w:type="dxa" w:w="2541"/>
+          </w:tcPr>
+          <w:p>
+            <w:r>
+              <w:t>Sajjad Ahmad</w:t>
+            </w:r>
+          </w:p>
+        </w:tc>
+        <w:tc>
+          <w:tcPr>
+            <w:tcW w:type="dxa" w:w="2541"/>
+          </w:tcPr>
+          <w:p>
+            <w:r>
+              <w:t>sajjad.danish@gmail.com</w:t>
+            </w:r>
+          </w:p>
+        </w:tc>
+        <w:tc>
+          <w:tcPr>
+            <w:tcW w:type="dxa" w:w="2541"/>
+          </w:tcPr>
+          <w:p>
+            <w:r>
+              <w:t>03005996696</w:t>
+            </w:r>
+          </w:p>
+        </w:tc>
+      </w:tr>
+      <w:tr>
+        <w:tc>
+          <w:tcPr>
+            <w:tcW w:type="dxa" w:w="2541"/>
+          </w:tcPr>
+          <w:p>
+            <w:r>
+              <w:t>Team Member #01</w:t>
+            </w:r>
+          </w:p>
+        </w:tc>
+        <w:tc>
+          <w:tcPr>
+            <w:tcW w:type="dxa" w:w="2541"/>
+          </w:tcPr>
+          <w:p>
+            <w:r>
+              <w:t>Anam Arif</w:t>
+            </w:r>
+          </w:p>
+        </w:tc>
+        <w:tc>
+          <w:tcPr>
+            <w:tcW w:type="dxa" w:w="2541"/>
+          </w:tcPr>
+          <w:p>
+            <w:r>
+              <w:t>anamarif28@gmail.com</w:t>
+            </w:r>
+          </w:p>
+        </w:tc>
+        <w:tc>
+          <w:tcPr>
+            <w:tcW w:type="dxa" w:w="2541"/>
+          </w:tcPr>
+          <w:p>
+            <w:r>
+              <w:t>03005025666</w:t>
+            </w:r>
+          </w:p>
+        </w:tc>
+      </w:tr>
+      <w:tr>
+        <w:tc>
+          <w:tcPr>
+            <w:tcW w:type="dxa" w:w="2541"/>
+          </w:tcPr>
+          <w:p>
+            <w:r>
+              <w:t>Team Member #02</w:t>
+            </w:r>
+          </w:p>
+        </w:tc>
+        <w:tc>
+          <w:tcPr>
+            <w:tcW w:type="dxa" w:w="2541"/>
+          </w:tcPr>
+          <w:p>
+            <w:r>
+              <w:t>Junaid Nagi</w:t>
+            </w:r>
+          </w:p>
+        </w:tc>
+        <w:tc>
+          <w:tcPr>
+            <w:tcW w:type="dxa" w:w="2541"/>
+          </w:tcPr>
+          <w:p>
+            <w:r>
+              <w:t>junaidnagi@gmail.com</w:t>
+            </w:r>
+          </w:p>
+        </w:tc>
+        <w:tc>
+          <w:tcPr>
+            <w:tcW w:type="dxa" w:w="2541"/>
+          </w:tcPr>
+          <w:p>
+            <w:r>
+              <w:t>03005525526</w:t>
+            </w:r>
+          </w:p>
+        </w:tc>
+      </w:tr>
+      <w:tr>
+        <w:tc>
+          <w:tcPr>
+            <w:tcW w:type="dxa" w:w="2541"/>
+          </w:tcPr>
+          <w:p>
+            <w:r>
+              <w:t>Team Member #03</w:t>
+            </w:r>
+          </w:p>
+        </w:tc>
+        <w:tc>
+          <w:tcPr>
+            <w:tcW w:type="dxa" w:w="2541"/>
+          </w:tcPr>
+          <w:p>
+            <w:r>
+              <w:t>Maleeha Saeed</w:t>
+            </w:r>
+          </w:p>
+        </w:tc>
+        <w:tc>
+          <w:tcPr>
+            <w:tcW w:type="dxa" w:w="2541"/>
+          </w:tcPr>
+          <w:p>
+            <w:r>
+              <w:t>maleehasaeed79@gmail.com</w:t>
+            </w:r>
+          </w:p>
+        </w:tc>
+        <w:tc>
+          <w:tcPr>
+            <w:tcW w:type="dxa" w:w="2541"/>
+          </w:tcPr>
+          <w:p>
+            <w:r>
+              <w:t>03005359436</w:t>
+            </w:r>
+          </w:p>
+        </w:tc>
+      </w:tr>
+    </w:tbl>
     <w:p>
       <w:pPr>
         <w:pStyle w:val="Heading1"/>

</xml_diff>